<commit_message>
Edit file Assignment3 Report
</commit_message>
<xml_diff>
--- a/Assignments/Assignment3/Documents/Assignment3_Team_Report.docx
+++ b/Assignments/Assignment3/Documents/Assignment3_Team_Report.docx
@@ -132,7 +132,16 @@
                                 <w:szCs w:val="28"/>
                                 <w:lang w:val="en-US"/>
                               </w:rPr>
-                              <w:t>Assignment 1</w:t>
+                              <w:t xml:space="preserve">Assignment </w:t>
+                            </w:r>
+                            <w:r>
+                              <w:rPr>
+                                <w:rFonts w:hint="default" w:cs="Times New Roman"/>
+                                <w:sz w:val="28"/>
+                                <w:szCs w:val="28"/>
+                                <w:lang w:val="en-US"/>
+                              </w:rPr>
+                              <w:t>3</w:t>
                             </w:r>
                           </w:p>
                         </w:txbxContent>
@@ -216,7 +225,16 @@
                           <w:szCs w:val="28"/>
                           <w:lang w:val="en-US"/>
                         </w:rPr>
-                        <w:t>Assignment 1</w:t>
+                        <w:t xml:space="preserve">Assignment </w:t>
+                      </w:r>
+                      <w:r>
+                        <w:rPr>
+                          <w:rFonts w:hint="default" w:cs="Times New Roman"/>
+                          <w:sz w:val="28"/>
+                          <w:szCs w:val="28"/>
+                          <w:lang w:val="en-US"/>
+                        </w:rPr>
+                        <w:t>3</w:t>
                       </w:r>
                     </w:p>
                   </w:txbxContent>
@@ -962,8 +980,6 @@
         </w:rPr>
         <w:t>words</w:t>
       </w:r>
-      <w:bookmarkStart w:id="0" w:name="_GoBack"/>
-      <w:bookmarkEnd w:id="0"/>
     </w:p>
     <w:p>
       <w:pPr>
@@ -1399,8 +1415,8 @@
       <w:r>
         <w:rPr>
           <w:rFonts w:hint="default"/>
-          <w:sz w:val="28"/>
-          <w:szCs w:val="28"/>
+          <w:sz w:val="32"/>
+          <w:szCs w:val="32"/>
           <w:lang w:val="en-US"/>
         </w:rPr>
         <w:fldChar w:fldCharType="begin"/>
@@ -1408,8 +1424,8 @@
       <w:r>
         <w:rPr>
           <w:rFonts w:hint="default"/>
-          <w:sz w:val="28"/>
-          <w:szCs w:val="28"/>
+          <w:sz w:val="32"/>
+          <w:szCs w:val="32"/>
           <w:lang w:val="en-US"/>
         </w:rPr>
         <w:instrText xml:space="preserve"> HYPERLINK \l _Toc4876 </w:instrText>
@@ -1417,8 +1433,8 @@
       <w:r>
         <w:rPr>
           <w:rFonts w:hint="default"/>
-          <w:sz w:val="28"/>
-          <w:szCs w:val="28"/>
+          <w:sz w:val="32"/>
+          <w:szCs w:val="32"/>
           <w:lang w:val="en-US"/>
         </w:rPr>
         <w:fldChar w:fldCharType="separate"/>
@@ -1426,8 +1442,8 @@
       <w:r>
         <w:rPr>
           <w:rFonts w:hint="default" w:ascii="Times New Roman" w:hAnsi="Times New Roman" w:cs="Times New Roman"/>
-          <w:sz w:val="28"/>
-          <w:szCs w:val="28"/>
+          <w:sz w:val="32"/>
+          <w:szCs w:val="32"/>
           <w:lang w:val="en-US"/>
         </w:rPr>
         <w:t xml:space="preserve">Part A: </w:t>
@@ -1435,16 +1451,16 @@
       <w:r>
         <w:rPr>
           <w:rFonts w:hint="default" w:cs="Times New Roman"/>
-          <w:sz w:val="28"/>
-          <w:szCs w:val="28"/>
+          <w:sz w:val="32"/>
+          <w:szCs w:val="32"/>
           <w:lang w:val="en-US"/>
         </w:rPr>
         <w:t>Requirement Redesign Analysis</w:t>
       </w:r>
       <w:r>
         <w:rPr>
-          <w:sz w:val="28"/>
-          <w:szCs w:val="28"/>
+          <w:sz w:val="32"/>
+          <w:szCs w:val="32"/>
         </w:rPr>
         <w:tab/>
       </w:r>
@@ -1460,8 +1476,8 @@
       <w:r>
         <w:rPr>
           <w:rFonts w:hint="default"/>
-          <w:sz w:val="28"/>
-          <w:szCs w:val="28"/>
+          <w:sz w:val="32"/>
+          <w:szCs w:val="32"/>
           <w:lang w:val="en-US"/>
         </w:rPr>
         <w:fldChar w:fldCharType="end"/>
@@ -1563,6 +1579,1048 @@
     </w:p>
     <w:p>
       <w:pPr>
+        <w:pStyle w:val="12"/>
+        <w:tabs>
+          <w:tab w:val="right" w:leader="dot" w:pos="8306"/>
+        </w:tabs>
+        <w:ind w:left="400" w:leftChars="100" w:firstLine="0" w:firstLineChars="0"/>
+        <w:rPr>
+          <w:rFonts w:hint="default"/>
+          <w:sz w:val="28"/>
+          <w:szCs w:val="28"/>
+          <w:lang w:val="en-US"/>
+        </w:rPr>
+      </w:pPr>
+      <w:r>
+        <w:rPr>
+          <w:rFonts w:hint="default"/>
+          <w:sz w:val="28"/>
+          <w:szCs w:val="28"/>
+          <w:lang w:val="en-US"/>
+        </w:rPr>
+        <w:fldChar w:fldCharType="begin"/>
+      </w:r>
+      <w:r>
+        <w:rPr>
+          <w:rFonts w:hint="default"/>
+          <w:sz w:val="28"/>
+          <w:szCs w:val="28"/>
+          <w:lang w:val="en-US"/>
+        </w:rPr>
+        <w:instrText xml:space="preserve"> HYPERLINK \l _Toc7289 </w:instrText>
+      </w:r>
+      <w:r>
+        <w:rPr>
+          <w:rFonts w:hint="default"/>
+          <w:sz w:val="28"/>
+          <w:szCs w:val="28"/>
+          <w:lang w:val="en-US"/>
+        </w:rPr>
+        <w:fldChar w:fldCharType="separate"/>
+      </w:r>
+      <w:r>
+        <w:rPr>
+          <w:rFonts w:hint="default"/>
+          <w:sz w:val="28"/>
+          <w:szCs w:val="28"/>
+          <w:lang w:val="en-US"/>
+        </w:rPr>
+        <w:t>1</w:t>
+      </w:r>
+      <w:r>
+        <w:rPr>
+          <w:rFonts w:hint="default" w:ascii="Times New Roman" w:hAnsi="Times New Roman" w:cs="Times New Roman"/>
+          <w:sz w:val="28"/>
+          <w:szCs w:val="28"/>
+          <w:lang w:val="en-US"/>
+        </w:rPr>
+        <w:t>.</w:t>
+      </w:r>
+      <w:r>
+        <w:rPr>
+          <w:rFonts w:hint="default" w:cs="Times New Roman"/>
+          <w:sz w:val="28"/>
+          <w:szCs w:val="28"/>
+          <w:lang w:val="en-US"/>
+        </w:rPr>
+        <w:t>2</w:t>
+      </w:r>
+      <w:r>
+        <w:rPr>
+          <w:rFonts w:hint="default" w:ascii="Times New Roman" w:hAnsi="Times New Roman" w:cs="Times New Roman"/>
+          <w:sz w:val="28"/>
+          <w:szCs w:val="28"/>
+          <w:lang w:val="en-US"/>
+        </w:rPr>
+        <w:t xml:space="preserve"> </w:t>
+      </w:r>
+      <w:r>
+        <w:rPr>
+          <w:rFonts w:hint="default" w:cs="Times New Roman"/>
+          <w:sz w:val="28"/>
+          <w:szCs w:val="28"/>
+          <w:lang w:val="en-US"/>
+        </w:rPr>
+        <w:t>Refined Overall Class Diagram</w:t>
+      </w:r>
+      <w:r>
+        <w:rPr>
+          <w:sz w:val="28"/>
+          <w:szCs w:val="28"/>
+        </w:rPr>
+        <w:tab/>
+      </w:r>
+      <w:r>
+        <w:rPr>
+          <w:rFonts w:hint="default"/>
+          <w:sz w:val="25"/>
+          <w:szCs w:val="25"/>
+          <w:lang w:val="en-US"/>
+        </w:rPr>
+        <w:t>X</w:t>
+      </w:r>
+      <w:r>
+        <w:rPr>
+          <w:rFonts w:hint="default"/>
+          <w:sz w:val="28"/>
+          <w:szCs w:val="28"/>
+          <w:lang w:val="en-US"/>
+        </w:rPr>
+        <w:fldChar w:fldCharType="end"/>
+      </w:r>
+    </w:p>
+    <w:p>
+      <w:pPr>
+        <w:pStyle w:val="12"/>
+        <w:tabs>
+          <w:tab w:val="right" w:leader="dot" w:pos="8306"/>
+        </w:tabs>
+        <w:ind w:left="800" w:leftChars="200" w:firstLine="0" w:firstLineChars="0"/>
+        <w:rPr>
+          <w:rFonts w:hint="default"/>
+          <w:sz w:val="25"/>
+          <w:szCs w:val="25"/>
+          <w:lang w:val="en-US"/>
+        </w:rPr>
+      </w:pPr>
+      <w:r>
+        <w:rPr>
+          <w:rFonts w:hint="default"/>
+          <w:sz w:val="25"/>
+          <w:szCs w:val="25"/>
+          <w:lang w:val="en-US"/>
+        </w:rPr>
+        <w:fldChar w:fldCharType="begin"/>
+      </w:r>
+      <w:r>
+        <w:rPr>
+          <w:rFonts w:hint="default"/>
+          <w:sz w:val="25"/>
+          <w:szCs w:val="25"/>
+          <w:lang w:val="en-US"/>
+        </w:rPr>
+        <w:instrText xml:space="preserve"> HYPERLINK \l _Toc7289 </w:instrText>
+      </w:r>
+      <w:r>
+        <w:rPr>
+          <w:rFonts w:hint="default"/>
+          <w:sz w:val="25"/>
+          <w:szCs w:val="25"/>
+          <w:lang w:val="en-US"/>
+        </w:rPr>
+        <w:fldChar w:fldCharType="separate"/>
+      </w:r>
+      <w:r>
+        <w:rPr>
+          <w:rFonts w:hint="default"/>
+          <w:sz w:val="25"/>
+          <w:szCs w:val="25"/>
+          <w:lang w:val="en-US"/>
+        </w:rPr>
+        <w:t>1</w:t>
+      </w:r>
+      <w:r>
+        <w:rPr>
+          <w:rFonts w:hint="default" w:ascii="Times New Roman" w:hAnsi="Times New Roman" w:cs="Times New Roman"/>
+          <w:sz w:val="25"/>
+          <w:szCs w:val="25"/>
+          <w:lang w:val="en-US"/>
+        </w:rPr>
+        <w:t>.</w:t>
+      </w:r>
+      <w:r>
+        <w:rPr>
+          <w:rFonts w:hint="default" w:cs="Times New Roman"/>
+          <w:sz w:val="25"/>
+          <w:szCs w:val="25"/>
+          <w:lang w:val="en-US"/>
+        </w:rPr>
+        <w:t>2.1</w:t>
+      </w:r>
+      <w:r>
+        <w:rPr>
+          <w:rFonts w:hint="default" w:ascii="Times New Roman" w:hAnsi="Times New Roman" w:cs="Times New Roman"/>
+          <w:sz w:val="25"/>
+          <w:szCs w:val="25"/>
+          <w:lang w:val="en-US"/>
+        </w:rPr>
+        <w:t xml:space="preserve"> </w:t>
+      </w:r>
+      <w:r>
+        <w:rPr>
+          <w:rFonts w:hint="default" w:cs="Times New Roman"/>
+          <w:sz w:val="25"/>
+          <w:szCs w:val="25"/>
+          <w:lang w:val="en-US"/>
+        </w:rPr>
+        <w:t>Admin Subsystem Class Diagram</w:t>
+      </w:r>
+      <w:r>
+        <w:rPr>
+          <w:sz w:val="25"/>
+          <w:szCs w:val="25"/>
+        </w:rPr>
+        <w:tab/>
+      </w:r>
+      <w:r>
+        <w:rPr>
+          <w:rFonts w:hint="default"/>
+          <w:sz w:val="25"/>
+          <w:szCs w:val="25"/>
+          <w:lang w:val="en-US"/>
+        </w:rPr>
+        <w:t>X</w:t>
+      </w:r>
+      <w:r>
+        <w:rPr>
+          <w:rFonts w:hint="default"/>
+          <w:sz w:val="25"/>
+          <w:szCs w:val="25"/>
+          <w:lang w:val="en-US"/>
+        </w:rPr>
+        <w:fldChar w:fldCharType="end"/>
+      </w:r>
+    </w:p>
+    <w:p>
+      <w:pPr>
+        <w:pStyle w:val="12"/>
+        <w:tabs>
+          <w:tab w:val="right" w:leader="dot" w:pos="8306"/>
+        </w:tabs>
+        <w:ind w:left="800" w:leftChars="200" w:firstLine="0" w:firstLineChars="0"/>
+        <w:rPr>
+          <w:rFonts w:hint="default"/>
+          <w:sz w:val="25"/>
+          <w:szCs w:val="25"/>
+          <w:lang w:val="en-US"/>
+        </w:rPr>
+      </w:pPr>
+      <w:r>
+        <w:rPr>
+          <w:rFonts w:hint="default"/>
+          <w:sz w:val="25"/>
+          <w:szCs w:val="25"/>
+          <w:lang w:val="en-US"/>
+        </w:rPr>
+        <w:fldChar w:fldCharType="begin"/>
+      </w:r>
+      <w:r>
+        <w:rPr>
+          <w:rFonts w:hint="default"/>
+          <w:sz w:val="25"/>
+          <w:szCs w:val="25"/>
+          <w:lang w:val="en-US"/>
+        </w:rPr>
+        <w:instrText xml:space="preserve"> HYPERLINK \l _Toc7289 </w:instrText>
+      </w:r>
+      <w:r>
+        <w:rPr>
+          <w:rFonts w:hint="default"/>
+          <w:sz w:val="25"/>
+          <w:szCs w:val="25"/>
+          <w:lang w:val="en-US"/>
+        </w:rPr>
+        <w:fldChar w:fldCharType="separate"/>
+      </w:r>
+      <w:r>
+        <w:rPr>
+          <w:rFonts w:hint="default"/>
+          <w:sz w:val="25"/>
+          <w:szCs w:val="25"/>
+          <w:lang w:val="en-US"/>
+        </w:rPr>
+        <w:t>1</w:t>
+      </w:r>
+      <w:r>
+        <w:rPr>
+          <w:rFonts w:hint="default" w:ascii="Times New Roman" w:hAnsi="Times New Roman" w:cs="Times New Roman"/>
+          <w:sz w:val="25"/>
+          <w:szCs w:val="25"/>
+          <w:lang w:val="en-US"/>
+        </w:rPr>
+        <w:t>.</w:t>
+      </w:r>
+      <w:r>
+        <w:rPr>
+          <w:rFonts w:hint="default" w:cs="Times New Roman"/>
+          <w:sz w:val="25"/>
+          <w:szCs w:val="25"/>
+          <w:lang w:val="en-US"/>
+        </w:rPr>
+        <w:t>2.2</w:t>
+      </w:r>
+      <w:r>
+        <w:rPr>
+          <w:rFonts w:hint="default" w:ascii="Times New Roman" w:hAnsi="Times New Roman" w:cs="Times New Roman"/>
+          <w:sz w:val="25"/>
+          <w:szCs w:val="25"/>
+          <w:lang w:val="en-US"/>
+        </w:rPr>
+        <w:t xml:space="preserve"> </w:t>
+      </w:r>
+      <w:r>
+        <w:rPr>
+          <w:rFonts w:hint="default" w:cs="Times New Roman"/>
+          <w:sz w:val="25"/>
+          <w:szCs w:val="25"/>
+          <w:lang w:val="en-US"/>
+        </w:rPr>
+        <w:t>Staff Subsystem Class Diagram</w:t>
+      </w:r>
+      <w:r>
+        <w:rPr>
+          <w:sz w:val="25"/>
+          <w:szCs w:val="25"/>
+        </w:rPr>
+        <w:tab/>
+      </w:r>
+      <w:r>
+        <w:rPr>
+          <w:rFonts w:hint="default"/>
+          <w:sz w:val="25"/>
+          <w:szCs w:val="25"/>
+          <w:lang w:val="en-US"/>
+        </w:rPr>
+        <w:t>X</w:t>
+      </w:r>
+      <w:r>
+        <w:rPr>
+          <w:rFonts w:hint="default"/>
+          <w:sz w:val="25"/>
+          <w:szCs w:val="25"/>
+          <w:lang w:val="en-US"/>
+        </w:rPr>
+        <w:fldChar w:fldCharType="end"/>
+      </w:r>
+    </w:p>
+    <w:p>
+      <w:pPr>
+        <w:pStyle w:val="12"/>
+        <w:tabs>
+          <w:tab w:val="right" w:leader="dot" w:pos="8306"/>
+        </w:tabs>
+        <w:ind w:left="800" w:leftChars="200" w:firstLine="0" w:firstLineChars="0"/>
+        <w:rPr>
+          <w:rFonts w:hint="default"/>
+          <w:sz w:val="25"/>
+          <w:szCs w:val="25"/>
+          <w:lang w:val="en-US"/>
+        </w:rPr>
+      </w:pPr>
+      <w:r>
+        <w:rPr>
+          <w:rFonts w:hint="default"/>
+          <w:sz w:val="25"/>
+          <w:szCs w:val="25"/>
+          <w:lang w:val="en-US"/>
+        </w:rPr>
+        <w:fldChar w:fldCharType="begin"/>
+      </w:r>
+      <w:r>
+        <w:rPr>
+          <w:rFonts w:hint="default"/>
+          <w:sz w:val="25"/>
+          <w:szCs w:val="25"/>
+          <w:lang w:val="en-US"/>
+        </w:rPr>
+        <w:instrText xml:space="preserve"> HYPERLINK \l _Toc7289 </w:instrText>
+      </w:r>
+      <w:r>
+        <w:rPr>
+          <w:rFonts w:hint="default"/>
+          <w:sz w:val="25"/>
+          <w:szCs w:val="25"/>
+          <w:lang w:val="en-US"/>
+        </w:rPr>
+        <w:fldChar w:fldCharType="separate"/>
+      </w:r>
+      <w:r>
+        <w:rPr>
+          <w:rFonts w:hint="default"/>
+          <w:sz w:val="25"/>
+          <w:szCs w:val="25"/>
+          <w:lang w:val="en-US"/>
+        </w:rPr>
+        <w:t>1</w:t>
+      </w:r>
+      <w:r>
+        <w:rPr>
+          <w:rFonts w:hint="default" w:ascii="Times New Roman" w:hAnsi="Times New Roman" w:cs="Times New Roman"/>
+          <w:sz w:val="25"/>
+          <w:szCs w:val="25"/>
+          <w:lang w:val="en-US"/>
+        </w:rPr>
+        <w:t>.</w:t>
+      </w:r>
+      <w:r>
+        <w:rPr>
+          <w:rFonts w:hint="default" w:cs="Times New Roman"/>
+          <w:sz w:val="25"/>
+          <w:szCs w:val="25"/>
+          <w:lang w:val="en-US"/>
+        </w:rPr>
+        <w:t>2.3</w:t>
+      </w:r>
+      <w:r>
+        <w:rPr>
+          <w:rFonts w:hint="default" w:ascii="Times New Roman" w:hAnsi="Times New Roman" w:cs="Times New Roman"/>
+          <w:sz w:val="25"/>
+          <w:szCs w:val="25"/>
+          <w:lang w:val="en-US"/>
+        </w:rPr>
+        <w:t xml:space="preserve"> </w:t>
+      </w:r>
+      <w:r>
+        <w:rPr>
+          <w:rFonts w:hint="default" w:cs="Times New Roman"/>
+          <w:sz w:val="25"/>
+          <w:szCs w:val="25"/>
+          <w:lang w:val="en-US"/>
+        </w:rPr>
+        <w:t>Customer Subsystem Class Diagram</w:t>
+      </w:r>
+      <w:r>
+        <w:rPr>
+          <w:sz w:val="25"/>
+          <w:szCs w:val="25"/>
+        </w:rPr>
+        <w:tab/>
+      </w:r>
+      <w:r>
+        <w:rPr>
+          <w:rFonts w:hint="default"/>
+          <w:sz w:val="25"/>
+          <w:szCs w:val="25"/>
+          <w:lang w:val="en-US"/>
+        </w:rPr>
+        <w:t>X</w:t>
+      </w:r>
+      <w:r>
+        <w:rPr>
+          <w:rFonts w:hint="default"/>
+          <w:sz w:val="25"/>
+          <w:szCs w:val="25"/>
+          <w:lang w:val="en-US"/>
+        </w:rPr>
+        <w:fldChar w:fldCharType="end"/>
+      </w:r>
+    </w:p>
+    <w:p>
+      <w:pPr>
+        <w:pStyle w:val="12"/>
+        <w:tabs>
+          <w:tab w:val="right" w:leader="dot" w:pos="8306"/>
+        </w:tabs>
+        <w:ind w:left="800" w:leftChars="200" w:firstLine="0" w:firstLineChars="0"/>
+        <w:rPr>
+          <w:rFonts w:hint="default"/>
+          <w:sz w:val="28"/>
+          <w:szCs w:val="28"/>
+          <w:lang w:val="en-US"/>
+        </w:rPr>
+      </w:pPr>
+      <w:r>
+        <w:rPr>
+          <w:rFonts w:hint="default"/>
+          <w:sz w:val="25"/>
+          <w:szCs w:val="25"/>
+          <w:lang w:val="en-US"/>
+        </w:rPr>
+        <w:fldChar w:fldCharType="begin"/>
+      </w:r>
+      <w:r>
+        <w:rPr>
+          <w:rFonts w:hint="default"/>
+          <w:sz w:val="25"/>
+          <w:szCs w:val="25"/>
+          <w:lang w:val="en-US"/>
+        </w:rPr>
+        <w:instrText xml:space="preserve"> HYPERLINK \l _Toc7289 </w:instrText>
+      </w:r>
+      <w:r>
+        <w:rPr>
+          <w:rFonts w:hint="default"/>
+          <w:sz w:val="25"/>
+          <w:szCs w:val="25"/>
+          <w:lang w:val="en-US"/>
+        </w:rPr>
+        <w:fldChar w:fldCharType="separate"/>
+      </w:r>
+      <w:r>
+        <w:rPr>
+          <w:rFonts w:hint="default"/>
+          <w:sz w:val="25"/>
+          <w:szCs w:val="25"/>
+          <w:lang w:val="en-US"/>
+        </w:rPr>
+        <w:t>1</w:t>
+      </w:r>
+      <w:r>
+        <w:rPr>
+          <w:rFonts w:hint="default" w:ascii="Times New Roman" w:hAnsi="Times New Roman" w:cs="Times New Roman"/>
+          <w:sz w:val="25"/>
+          <w:szCs w:val="25"/>
+          <w:lang w:val="en-US"/>
+        </w:rPr>
+        <w:t>.</w:t>
+      </w:r>
+      <w:r>
+        <w:rPr>
+          <w:rFonts w:hint="default" w:cs="Times New Roman"/>
+          <w:sz w:val="25"/>
+          <w:szCs w:val="25"/>
+          <w:lang w:val="en-US"/>
+        </w:rPr>
+        <w:t>2.4</w:t>
+      </w:r>
+      <w:r>
+        <w:rPr>
+          <w:rFonts w:hint="default" w:ascii="Times New Roman" w:hAnsi="Times New Roman" w:cs="Times New Roman"/>
+          <w:sz w:val="25"/>
+          <w:szCs w:val="25"/>
+          <w:lang w:val="en-US"/>
+        </w:rPr>
+        <w:t xml:space="preserve"> </w:t>
+      </w:r>
+      <w:r>
+        <w:rPr>
+          <w:rFonts w:hint="default" w:cs="Times New Roman"/>
+          <w:sz w:val="25"/>
+          <w:szCs w:val="25"/>
+          <w:lang w:val="en-US"/>
+        </w:rPr>
+        <w:t>Design Changes and Rationale</w:t>
+      </w:r>
+      <w:r>
+        <w:rPr>
+          <w:sz w:val="25"/>
+          <w:szCs w:val="25"/>
+        </w:rPr>
+        <w:tab/>
+      </w:r>
+      <w:r>
+        <w:rPr>
+          <w:rFonts w:hint="default"/>
+          <w:sz w:val="25"/>
+          <w:szCs w:val="25"/>
+          <w:lang w:val="en-US"/>
+        </w:rPr>
+        <w:t>X</w:t>
+      </w:r>
+      <w:r>
+        <w:rPr>
+          <w:rFonts w:hint="default"/>
+          <w:sz w:val="25"/>
+          <w:szCs w:val="25"/>
+          <w:lang w:val="en-US"/>
+        </w:rPr>
+        <w:fldChar w:fldCharType="end"/>
+      </w:r>
+      <w:r>
+        <w:rPr>
+          <w:rFonts w:hint="default"/>
+          <w:sz w:val="25"/>
+          <w:szCs w:val="25"/>
+          <w:lang w:val="en-US"/>
+        </w:rPr>
+        <w:br w:type="textWrapping"/>
+      </w:r>
+    </w:p>
+    <w:p>
+      <w:pPr>
+        <w:pStyle w:val="12"/>
+        <w:tabs>
+          <w:tab w:val="right" w:leader="dot" w:pos="8306"/>
+        </w:tabs>
+        <w:ind w:left="800" w:leftChars="200" w:firstLine="0" w:firstLineChars="0"/>
+        <w:rPr>
+          <w:rFonts w:hint="default"/>
+          <w:sz w:val="28"/>
+          <w:szCs w:val="28"/>
+          <w:lang w:val="en-US"/>
+        </w:rPr>
+      </w:pPr>
+    </w:p>
+    <w:p>
+      <w:pPr>
+        <w:pStyle w:val="12"/>
+        <w:tabs>
+          <w:tab w:val="right" w:leader="dot" w:pos="8306"/>
+        </w:tabs>
+        <w:ind w:left="800" w:leftChars="200" w:firstLine="0" w:firstLineChars="0"/>
+        <w:rPr>
+          <w:rFonts w:hint="default"/>
+          <w:sz w:val="28"/>
+          <w:szCs w:val="28"/>
+          <w:lang w:val="en-US"/>
+        </w:rPr>
+      </w:pPr>
+    </w:p>
+    <w:p>
+      <w:pPr>
+        <w:pStyle w:val="12"/>
+        <w:tabs>
+          <w:tab w:val="right" w:leader="dot" w:pos="8306"/>
+        </w:tabs>
+        <w:ind w:left="800" w:leftChars="200" w:firstLine="0" w:firstLineChars="0"/>
+        <w:rPr>
+          <w:rFonts w:hint="default"/>
+          <w:sz w:val="28"/>
+          <w:szCs w:val="28"/>
+          <w:lang w:val="en-US"/>
+        </w:rPr>
+      </w:pPr>
+    </w:p>
+    <w:p>
+      <w:pPr>
+        <w:pStyle w:val="12"/>
+        <w:tabs>
+          <w:tab w:val="right" w:leader="dot" w:pos="8306"/>
+        </w:tabs>
+        <w:ind w:left="800" w:leftChars="200" w:firstLine="0" w:firstLineChars="0"/>
+        <w:rPr>
+          <w:rFonts w:hint="default"/>
+          <w:sz w:val="28"/>
+          <w:szCs w:val="28"/>
+          <w:lang w:val="en-US"/>
+        </w:rPr>
+      </w:pPr>
+    </w:p>
+    <w:p>
+      <w:pPr>
+        <w:pStyle w:val="12"/>
+        <w:tabs>
+          <w:tab w:val="right" w:leader="dot" w:pos="8306"/>
+        </w:tabs>
+        <w:ind w:left="800" w:leftChars="200" w:firstLine="0" w:firstLineChars="0"/>
+        <w:rPr>
+          <w:rFonts w:hint="default"/>
+          <w:sz w:val="28"/>
+          <w:szCs w:val="28"/>
+          <w:lang w:val="en-US"/>
+        </w:rPr>
+      </w:pPr>
+    </w:p>
+    <w:p>
+      <w:pPr>
+        <w:pStyle w:val="12"/>
+        <w:tabs>
+          <w:tab w:val="right" w:leader="dot" w:pos="8306"/>
+        </w:tabs>
+        <w:ind w:left="800" w:leftChars="200" w:firstLine="0" w:firstLineChars="0"/>
+        <w:rPr>
+          <w:rFonts w:hint="default"/>
+          <w:sz w:val="28"/>
+          <w:szCs w:val="28"/>
+          <w:lang w:val="en-US"/>
+        </w:rPr>
+      </w:pPr>
+    </w:p>
+    <w:p>
+      <w:pPr>
+        <w:pStyle w:val="12"/>
+        <w:tabs>
+          <w:tab w:val="right" w:leader="dot" w:pos="8306"/>
+        </w:tabs>
+        <w:ind w:left="800" w:leftChars="200" w:firstLine="0" w:firstLineChars="0"/>
+        <w:rPr>
+          <w:rFonts w:hint="default"/>
+          <w:sz w:val="28"/>
+          <w:szCs w:val="28"/>
+          <w:lang w:val="en-US"/>
+        </w:rPr>
+      </w:pPr>
+    </w:p>
+    <w:p>
+      <w:pPr>
+        <w:pStyle w:val="12"/>
+        <w:tabs>
+          <w:tab w:val="right" w:leader="dot" w:pos="8306"/>
+        </w:tabs>
+        <w:ind w:left="800" w:leftChars="200" w:firstLine="0" w:firstLineChars="0"/>
+        <w:rPr>
+          <w:rFonts w:hint="default"/>
+          <w:sz w:val="28"/>
+          <w:szCs w:val="28"/>
+          <w:lang w:val="en-US"/>
+        </w:rPr>
+      </w:pPr>
+    </w:p>
+    <w:p>
+      <w:pPr>
+        <w:pStyle w:val="12"/>
+        <w:tabs>
+          <w:tab w:val="right" w:leader="dot" w:pos="8306"/>
+        </w:tabs>
+        <w:ind w:left="800" w:leftChars="200" w:firstLine="0" w:firstLineChars="0"/>
+        <w:rPr>
+          <w:rFonts w:hint="default"/>
+          <w:sz w:val="28"/>
+          <w:szCs w:val="28"/>
+          <w:lang w:val="en-US"/>
+        </w:rPr>
+      </w:pPr>
+    </w:p>
+    <w:p>
+      <w:pPr>
+        <w:pStyle w:val="12"/>
+        <w:tabs>
+          <w:tab w:val="right" w:leader="dot" w:pos="8306"/>
+        </w:tabs>
+        <w:ind w:left="800" w:leftChars="200" w:firstLine="0" w:firstLineChars="0"/>
+        <w:rPr>
+          <w:rFonts w:hint="default"/>
+          <w:sz w:val="28"/>
+          <w:szCs w:val="28"/>
+          <w:lang w:val="en-US"/>
+        </w:rPr>
+      </w:pPr>
+    </w:p>
+    <w:p>
+      <w:pPr>
+        <w:pStyle w:val="12"/>
+        <w:tabs>
+          <w:tab w:val="right" w:leader="dot" w:pos="8306"/>
+        </w:tabs>
+        <w:ind w:left="800" w:leftChars="200" w:firstLine="0" w:firstLineChars="0"/>
+        <w:rPr>
+          <w:rFonts w:hint="default"/>
+          <w:sz w:val="28"/>
+          <w:szCs w:val="28"/>
+          <w:lang w:val="en-US"/>
+        </w:rPr>
+      </w:pPr>
+    </w:p>
+    <w:p>
+      <w:pPr>
+        <w:pStyle w:val="12"/>
+        <w:tabs>
+          <w:tab w:val="right" w:leader="dot" w:pos="8306"/>
+        </w:tabs>
+        <w:ind w:left="800" w:leftChars="200" w:firstLine="0" w:firstLineChars="0"/>
+        <w:rPr>
+          <w:rFonts w:hint="default"/>
+          <w:sz w:val="28"/>
+          <w:szCs w:val="28"/>
+          <w:lang w:val="en-US"/>
+        </w:rPr>
+      </w:pPr>
+    </w:p>
+    <w:p>
+      <w:pPr>
+        <w:pStyle w:val="12"/>
+        <w:tabs>
+          <w:tab w:val="right" w:leader="dot" w:pos="8306"/>
+        </w:tabs>
+        <w:ind w:left="800" w:leftChars="200" w:firstLine="0" w:firstLineChars="0"/>
+        <w:rPr>
+          <w:rFonts w:hint="default"/>
+          <w:sz w:val="28"/>
+          <w:szCs w:val="28"/>
+          <w:lang w:val="en-US"/>
+        </w:rPr>
+      </w:pPr>
+    </w:p>
+    <w:p>
+      <w:pPr>
+        <w:pStyle w:val="12"/>
+        <w:tabs>
+          <w:tab w:val="right" w:leader="dot" w:pos="8306"/>
+        </w:tabs>
+        <w:ind w:left="800" w:leftChars="200" w:firstLine="0" w:firstLineChars="0"/>
+        <w:rPr>
+          <w:rFonts w:hint="default"/>
+          <w:sz w:val="28"/>
+          <w:szCs w:val="28"/>
+          <w:lang w:val="en-US"/>
+        </w:rPr>
+      </w:pPr>
+    </w:p>
+    <w:p>
+      <w:pPr>
+        <w:pStyle w:val="12"/>
+        <w:tabs>
+          <w:tab w:val="right" w:leader="dot" w:pos="8306"/>
+        </w:tabs>
+        <w:ind w:left="800" w:leftChars="200" w:firstLine="0" w:firstLineChars="0"/>
+        <w:rPr>
+          <w:rFonts w:hint="default"/>
+          <w:sz w:val="28"/>
+          <w:szCs w:val="28"/>
+          <w:lang w:val="en-US"/>
+        </w:rPr>
+      </w:pPr>
+    </w:p>
+    <w:p>
+      <w:pPr>
+        <w:pStyle w:val="12"/>
+        <w:tabs>
+          <w:tab w:val="right" w:leader="dot" w:pos="8306"/>
+        </w:tabs>
+        <w:ind w:left="800" w:leftChars="200" w:firstLine="0" w:firstLineChars="0"/>
+        <w:rPr>
+          <w:rFonts w:hint="default"/>
+          <w:sz w:val="28"/>
+          <w:szCs w:val="28"/>
+          <w:lang w:val="en-US"/>
+        </w:rPr>
+      </w:pPr>
+    </w:p>
+    <w:p>
+      <w:pPr>
+        <w:pStyle w:val="12"/>
+        <w:tabs>
+          <w:tab w:val="right" w:leader="dot" w:pos="8306"/>
+        </w:tabs>
+        <w:ind w:left="800" w:leftChars="200" w:firstLine="0" w:firstLineChars="0"/>
+        <w:rPr>
+          <w:rFonts w:hint="default"/>
+          <w:sz w:val="28"/>
+          <w:szCs w:val="28"/>
+          <w:lang w:val="en-US"/>
+        </w:rPr>
+      </w:pPr>
+    </w:p>
+    <w:p>
+      <w:pPr>
+        <w:pStyle w:val="12"/>
+        <w:tabs>
+          <w:tab w:val="right" w:leader="dot" w:pos="8306"/>
+        </w:tabs>
+        <w:ind w:left="800" w:leftChars="200" w:firstLine="0" w:firstLineChars="0"/>
+        <w:rPr>
+          <w:rFonts w:hint="default"/>
+          <w:sz w:val="28"/>
+          <w:szCs w:val="28"/>
+          <w:lang w:val="en-US"/>
+        </w:rPr>
+      </w:pPr>
+    </w:p>
+    <w:p>
+      <w:pPr>
+        <w:pStyle w:val="12"/>
+        <w:tabs>
+          <w:tab w:val="right" w:leader="dot" w:pos="8306"/>
+        </w:tabs>
+        <w:ind w:left="800" w:leftChars="200" w:firstLine="0" w:firstLineChars="0"/>
+        <w:rPr>
+          <w:rFonts w:hint="default"/>
+          <w:sz w:val="28"/>
+          <w:szCs w:val="28"/>
+          <w:lang w:val="en-US"/>
+        </w:rPr>
+      </w:pPr>
+    </w:p>
+    <w:p>
+      <w:pPr>
+        <w:pStyle w:val="12"/>
+        <w:tabs>
+          <w:tab w:val="right" w:leader="dot" w:pos="8306"/>
+        </w:tabs>
+        <w:ind w:left="800" w:leftChars="200" w:firstLine="0" w:firstLineChars="0"/>
+        <w:rPr>
+          <w:rFonts w:hint="default"/>
+          <w:sz w:val="28"/>
+          <w:szCs w:val="28"/>
+          <w:lang w:val="en-US"/>
+        </w:rPr>
+      </w:pPr>
+    </w:p>
+    <w:p>
+      <w:pPr>
+        <w:pStyle w:val="12"/>
+        <w:tabs>
+          <w:tab w:val="right" w:leader="dot" w:pos="8306"/>
+        </w:tabs>
+        <w:ind w:left="800" w:leftChars="200" w:firstLine="0" w:firstLineChars="0"/>
+        <w:rPr>
+          <w:rFonts w:hint="default"/>
+          <w:sz w:val="28"/>
+          <w:szCs w:val="28"/>
+          <w:lang w:val="en-US"/>
+        </w:rPr>
+      </w:pPr>
+    </w:p>
+    <w:p>
+      <w:pPr>
+        <w:pStyle w:val="2"/>
+        <w:bidi w:val="0"/>
+        <w:spacing w:line="240" w:lineRule="auto"/>
+        <w:rPr>
+          <w:rFonts w:hint="default"/>
+          <w:lang w:val="en-US"/>
+        </w:rPr>
+      </w:pPr>
+      <w:r>
+        <w:rPr>
+          <w:rFonts w:hint="default"/>
+          <w:lang w:val="en-US"/>
+        </w:rPr>
+        <w:t>Part A: Requirement Redesign Analysis</w:t>
+      </w:r>
+    </w:p>
+    <w:p>
+      <w:pPr>
+        <w:pStyle w:val="3"/>
+        <w:bidi w:val="0"/>
+        <w:spacing w:line="240" w:lineRule="auto"/>
+        <w:ind w:left="400" w:leftChars="100" w:firstLine="0" w:firstLineChars="0"/>
+        <w:jc w:val="both"/>
+        <w:rPr>
+          <w:rFonts w:hint="default"/>
+          <w:lang w:val="en-US"/>
+        </w:rPr>
+      </w:pPr>
+      <w:r>
+        <w:rPr>
+          <w:rFonts w:hint="default"/>
+          <w:lang w:val="en-US"/>
+        </w:rPr>
+        <w:t>1. Case Study Requirement Analysis</w:t>
+      </w:r>
+      <w:r>
+        <w:rPr>
+          <w:rFonts w:hint="default"/>
+          <w:lang w:val="en-US"/>
+        </w:rPr>
+        <w:br w:type="textWrapping"/>
+      </w:r>
+      <w:r>
+        <w:rPr>
+          <w:rFonts w:hint="default"/>
+          <w:lang w:val="en-US"/>
+        </w:rPr>
+        <w:br w:type="textWrapping"/>
+      </w:r>
+      <w:r>
+        <w:rPr>
+          <w:rFonts w:hint="default" w:ascii="Times New Roman" w:hAnsi="Times New Roman" w:eastAsia="SimSun" w:cs="Times New Roman"/>
+          <w:b w:val="0"/>
+          <w:bCs w:val="0"/>
+          <w:sz w:val="24"/>
+          <w:szCs w:val="24"/>
+        </w:rPr>
+        <w:t>First and foremost, the third assignment requires students to transition the architectural design from the second assignment into a fully functional software implementation. Consequently, the team members decided to re-evaluate the identified system roles, problem domain, functional requirements, and task descriptions to ensure that our proposed solutions effectively address the challenges ABC-Trans is facing. During the re-analysis phase, team members noticed that three specific roles were mentioned in the case study, including platform administrators (admin), company staff, and customers. By addressing these identified design flaws, the team refined and reconstructed the overall class diagram to ensure comprehensive system coverage and proper role-based architecture, guaranteeing that all roles are included</w:t>
+      </w:r>
+      <w:r>
+        <w:rPr>
+          <w:rFonts w:hint="default" w:ascii="Times New Roman" w:hAnsi="Times New Roman" w:eastAsia="SimSun" w:cs="Times New Roman"/>
+          <w:b w:val="0"/>
+          <w:bCs w:val="0"/>
+          <w:sz w:val="24"/>
+          <w:szCs w:val="24"/>
+          <w:lang w:val="en-US"/>
+        </w:rPr>
+        <w:t>.</w:t>
+      </w:r>
+    </w:p>
+    <w:p>
+      <w:pPr>
+        <w:pStyle w:val="3"/>
+        <w:bidi w:val="0"/>
+        <w:ind w:left="400" w:leftChars="100" w:firstLine="0" w:firstLineChars="0"/>
+        <w:rPr>
+          <w:rFonts w:hint="default"/>
+          <w:lang w:val="en-US"/>
+        </w:rPr>
+      </w:pPr>
+      <w:r>
+        <w:rPr>
+          <w:rFonts w:hint="default"/>
+          <w:lang w:val="en-US"/>
+        </w:rPr>
+        <w:drawing>
+          <wp:anchor distT="0" distB="0" distL="114300" distR="114300" simplePos="0" relativeHeight="251662336" behindDoc="1" locked="0" layoutInCell="1" allowOverlap="1">
+            <wp:simplePos x="0" y="0"/>
+            <wp:positionH relativeFrom="column">
+              <wp:posOffset>648970</wp:posOffset>
+            </wp:positionH>
+            <wp:positionV relativeFrom="paragraph">
+              <wp:posOffset>319405</wp:posOffset>
+            </wp:positionV>
+            <wp:extent cx="3977005" cy="5306060"/>
+            <wp:effectExtent l="0" t="0" r="0" b="0"/>
+            <wp:wrapTight wrapText="bothSides">
+              <wp:wrapPolygon>
+                <wp:start x="0" y="0"/>
+                <wp:lineTo x="0" y="21528"/>
+                <wp:lineTo x="21521" y="21528"/>
+                <wp:lineTo x="21521" y="0"/>
+                <wp:lineTo x="0" y="0"/>
+              </wp:wrapPolygon>
+            </wp:wrapTight>
+            <wp:docPr id="1" name="Picture 1" descr="Updated_Class_Diagram_Overall"/>
+            <wp:cNvGraphicFramePr>
+              <a:graphicFrameLocks xmlns:a="http://schemas.openxmlformats.org/drawingml/2006/main" noChangeAspect="1"/>
+            </wp:cNvGraphicFramePr>
+            <a:graphic xmlns:a="http://schemas.openxmlformats.org/drawingml/2006/main">
+              <a:graphicData uri="http://schemas.openxmlformats.org/drawingml/2006/picture">
+                <pic:pic xmlns:pic="http://schemas.openxmlformats.org/drawingml/2006/picture">
+                  <pic:nvPicPr>
+                    <pic:cNvPr id="1" name="Picture 1" descr="Updated_Class_Diagram_Overall"/>
+                    <pic:cNvPicPr>
+                      <a:picLocks noChangeAspect="1"/>
+                    </pic:cNvPicPr>
+                  </pic:nvPicPr>
+                  <pic:blipFill>
+                    <a:blip r:embed="rId8"/>
+                    <a:stretch>
+                      <a:fillRect/>
+                    </a:stretch>
+                  </pic:blipFill>
+                  <pic:spPr>
+                    <a:xfrm>
+                      <a:off x="0" y="0"/>
+                      <a:ext cx="3977005" cy="5306060"/>
+                    </a:xfrm>
+                    <a:prstGeom prst="rect">
+                      <a:avLst/>
+                    </a:prstGeom>
+                  </pic:spPr>
+                </pic:pic>
+              </a:graphicData>
+            </a:graphic>
+          </wp:anchor>
+        </w:drawing>
+      </w:r>
+      <w:r>
+        <w:rPr>
+          <w:rFonts w:hint="default"/>
+          <w:lang w:val="en-US"/>
+        </w:rPr>
+        <w:t>2. Refined Overall Class Diagram</w:t>
+      </w:r>
+    </w:p>
+    <w:p>
+      <w:pPr>
+        <w:rPr>
+          <w:rFonts w:hint="default"/>
+          <w:lang w:val="en-US"/>
+        </w:rPr>
+      </w:pPr>
+    </w:p>
+    <w:p>
+      <w:pPr>
         <w:pStyle w:val="13"/>
         <w:tabs>
           <w:tab w:val="right" w:leader="dot" w:pos="8306"/>
@@ -1614,38 +2672,304 @@
         <w:pStyle w:val="12"/>
         <w:bidi w:val="0"/>
         <w:ind w:left="0" w:leftChars="0" w:firstLine="0" w:firstLineChars="0"/>
-        <w:rPr>
-          <w:rFonts w:hint="default"/>
-          <w:lang w:val="en-US"/>
-        </w:rPr>
-      </w:pPr>
-    </w:p>
-    <w:p>
-      <w:pPr>
-        <w:pStyle w:val="2"/>
-        <w:keepNext w:val="0"/>
-        <w:keepLines w:val="0"/>
-        <w:pageBreakBefore w:val="0"/>
-        <w:widowControl/>
-        <w:tabs>
-          <w:tab w:val="right" w:leader="dot" w:pos="3360"/>
-        </w:tabs>
-        <w:kinsoku/>
-        <w:wordWrap/>
-        <w:overflowPunct/>
-        <w:topLinePunct w:val="0"/>
-        <w:autoSpaceDE/>
-        <w:autoSpaceDN/>
-        <w:bidi w:val="0"/>
-        <w:adjustRightInd/>
-        <w:snapToGrid/>
-        <w:spacing w:line="240" w:lineRule="auto"/>
-        <w:textAlignment w:val="auto"/>
-        <w:rPr>
-          <w:rFonts w:hint="default" w:ascii="Times New Roman" w:hAnsi="Times New Roman" w:cs="Times New Roman"/>
-          <w:lang w:val="en-US"/>
-        </w:rPr>
-      </w:pPr>
+        <w:jc w:val="center"/>
+        <w:rPr>
+          <w:rFonts w:hint="default"/>
+          <w:i/>
+          <w:iCs/>
+          <w:sz w:val="21"/>
+          <w:szCs w:val="21"/>
+          <w:lang w:val="en-US"/>
+        </w:rPr>
+      </w:pPr>
+      <w:r>
+        <w:rPr>
+          <w:rFonts w:hint="default"/>
+          <w:i/>
+          <w:iCs/>
+          <w:sz w:val="21"/>
+          <w:szCs w:val="21"/>
+          <w:lang w:val="en-US"/>
+        </w:rPr>
+        <w:br w:type="textWrapping"/>
+      </w:r>
+      <w:r>
+        <w:rPr>
+          <w:rFonts w:hint="default"/>
+          <w:i/>
+          <w:iCs/>
+          <w:sz w:val="21"/>
+          <w:szCs w:val="21"/>
+          <w:lang w:val="en-US"/>
+        </w:rPr>
+        <w:br w:type="textWrapping"/>
+      </w:r>
+      <w:r>
+        <w:rPr>
+          <w:rFonts w:hint="default"/>
+          <w:i/>
+          <w:iCs/>
+          <w:sz w:val="21"/>
+          <w:szCs w:val="21"/>
+          <w:lang w:val="en-US"/>
+        </w:rPr>
+        <w:br w:type="textWrapping"/>
+      </w:r>
+      <w:r>
+        <w:rPr>
+          <w:rFonts w:hint="default"/>
+          <w:i/>
+          <w:iCs/>
+          <w:sz w:val="21"/>
+          <w:szCs w:val="21"/>
+          <w:lang w:val="en-US"/>
+        </w:rPr>
+        <w:br w:type="textWrapping"/>
+      </w:r>
+      <w:r>
+        <w:rPr>
+          <w:rFonts w:hint="default"/>
+          <w:i/>
+          <w:iCs/>
+          <w:sz w:val="21"/>
+          <w:szCs w:val="21"/>
+          <w:lang w:val="en-US"/>
+        </w:rPr>
+        <w:br w:type="textWrapping"/>
+      </w:r>
+      <w:r>
+        <w:rPr>
+          <w:rFonts w:hint="default"/>
+          <w:i/>
+          <w:iCs/>
+          <w:sz w:val="21"/>
+          <w:szCs w:val="21"/>
+          <w:lang w:val="en-US"/>
+        </w:rPr>
+        <w:br w:type="textWrapping"/>
+      </w:r>
+      <w:r>
+        <w:rPr>
+          <w:rFonts w:hint="default"/>
+          <w:i/>
+          <w:iCs/>
+          <w:sz w:val="21"/>
+          <w:szCs w:val="21"/>
+          <w:lang w:val="en-US"/>
+        </w:rPr>
+        <w:br w:type="textWrapping"/>
+      </w:r>
+      <w:r>
+        <w:rPr>
+          <w:rFonts w:hint="default"/>
+          <w:i/>
+          <w:iCs/>
+          <w:sz w:val="21"/>
+          <w:szCs w:val="21"/>
+          <w:lang w:val="en-US"/>
+        </w:rPr>
+        <w:br w:type="textWrapping"/>
+      </w:r>
+      <w:r>
+        <w:rPr>
+          <w:rFonts w:hint="default"/>
+          <w:i/>
+          <w:iCs/>
+          <w:sz w:val="21"/>
+          <w:szCs w:val="21"/>
+          <w:lang w:val="en-US"/>
+        </w:rPr>
+        <w:br w:type="textWrapping"/>
+      </w:r>
+      <w:r>
+        <w:rPr>
+          <w:rFonts w:hint="default"/>
+          <w:i/>
+          <w:iCs/>
+          <w:sz w:val="21"/>
+          <w:szCs w:val="21"/>
+          <w:lang w:val="en-US"/>
+        </w:rPr>
+        <w:br w:type="textWrapping"/>
+      </w:r>
+      <w:r>
+        <w:rPr>
+          <w:rFonts w:hint="default"/>
+          <w:i/>
+          <w:iCs/>
+          <w:sz w:val="21"/>
+          <w:szCs w:val="21"/>
+          <w:lang w:val="en-US"/>
+        </w:rPr>
+        <w:br w:type="textWrapping"/>
+      </w:r>
+      <w:r>
+        <w:rPr>
+          <w:rFonts w:hint="default"/>
+          <w:i/>
+          <w:iCs/>
+          <w:sz w:val="21"/>
+          <w:szCs w:val="21"/>
+          <w:lang w:val="en-US"/>
+        </w:rPr>
+        <w:br w:type="textWrapping"/>
+      </w:r>
+      <w:bookmarkStart w:id="0" w:name="_GoBack"/>
+      <w:bookmarkEnd w:id="0"/>
+      <w:r>
+        <w:rPr>
+          <w:rFonts w:hint="default"/>
+          <w:i/>
+          <w:iCs/>
+          <w:sz w:val="21"/>
+          <w:szCs w:val="21"/>
+          <w:lang w:val="en-US"/>
+        </w:rPr>
+        <w:br w:type="textWrapping"/>
+      </w:r>
+      <w:r>
+        <w:rPr>
+          <w:rFonts w:hint="default"/>
+          <w:i/>
+          <w:iCs/>
+          <w:sz w:val="21"/>
+          <w:szCs w:val="21"/>
+          <w:lang w:val="en-US"/>
+        </w:rPr>
+        <w:br w:type="textWrapping"/>
+      </w:r>
+      <w:r>
+        <w:rPr>
+          <w:rFonts w:hint="default"/>
+          <w:i/>
+          <w:iCs/>
+          <w:sz w:val="21"/>
+          <w:szCs w:val="21"/>
+          <w:lang w:val="en-US"/>
+        </w:rPr>
+        <w:br w:type="textWrapping"/>
+      </w:r>
+      <w:r>
+        <w:rPr>
+          <w:rFonts w:hint="default"/>
+          <w:i/>
+          <w:iCs/>
+          <w:sz w:val="21"/>
+          <w:szCs w:val="21"/>
+          <w:lang w:val="en-US"/>
+        </w:rPr>
+        <w:br w:type="textWrapping"/>
+      </w:r>
+      <w:r>
+        <w:rPr>
+          <w:rFonts w:hint="default"/>
+          <w:i/>
+          <w:iCs/>
+          <w:sz w:val="21"/>
+          <w:szCs w:val="21"/>
+          <w:lang w:val="en-US"/>
+        </w:rPr>
+        <w:br w:type="textWrapping"/>
+      </w:r>
+      <w:r>
+        <w:rPr>
+          <w:rFonts w:hint="default"/>
+          <w:i/>
+          <w:iCs/>
+          <w:sz w:val="21"/>
+          <w:szCs w:val="21"/>
+          <w:lang w:val="en-US"/>
+        </w:rPr>
+        <w:br w:type="textWrapping"/>
+      </w:r>
+      <w:r>
+        <w:rPr>
+          <w:rFonts w:hint="default"/>
+          <w:i/>
+          <w:iCs/>
+          <w:sz w:val="21"/>
+          <w:szCs w:val="21"/>
+          <w:lang w:val="en-US"/>
+        </w:rPr>
+        <w:br w:type="textWrapping"/>
+      </w:r>
+      <w:r>
+        <w:rPr>
+          <w:rFonts w:hint="default"/>
+          <w:i/>
+          <w:iCs/>
+          <w:sz w:val="21"/>
+          <w:szCs w:val="21"/>
+          <w:lang w:val="en-US"/>
+        </w:rPr>
+        <w:br w:type="textWrapping"/>
+      </w:r>
+      <w:r>
+        <w:rPr>
+          <w:rFonts w:hint="default"/>
+          <w:i/>
+          <w:iCs/>
+          <w:sz w:val="21"/>
+          <w:szCs w:val="21"/>
+          <w:lang w:val="en-US"/>
+        </w:rPr>
+        <w:br w:type="textWrapping"/>
+      </w:r>
+      <w:r>
+        <w:rPr>
+          <w:rFonts w:hint="default"/>
+          <w:i/>
+          <w:iCs/>
+          <w:sz w:val="21"/>
+          <w:szCs w:val="21"/>
+          <w:lang w:val="en-US"/>
+        </w:rPr>
+        <w:br w:type="textWrapping"/>
+      </w:r>
+      <w:r>
+        <w:rPr>
+          <w:rFonts w:hint="default"/>
+          <w:i/>
+          <w:iCs/>
+          <w:sz w:val="21"/>
+          <w:szCs w:val="21"/>
+          <w:lang w:val="en-US"/>
+        </w:rPr>
+        <w:br w:type="textWrapping"/>
+      </w:r>
+      <w:r>
+        <w:rPr>
+          <w:rFonts w:hint="default"/>
+          <w:i/>
+          <w:iCs/>
+          <w:sz w:val="21"/>
+          <w:szCs w:val="21"/>
+          <w:lang w:val="en-US"/>
+        </w:rPr>
+        <w:br w:type="textWrapping"/>
+      </w:r>
+      <w:r>
+        <w:rPr>
+          <w:rFonts w:hint="default"/>
+          <w:i/>
+          <w:iCs/>
+          <w:sz w:val="21"/>
+          <w:szCs w:val="21"/>
+          <w:lang w:val="en-US"/>
+        </w:rPr>
+        <w:br w:type="textWrapping"/>
+      </w:r>
+      <w:r>
+        <w:rPr>
+          <w:rFonts w:hint="default"/>
+          <w:i/>
+          <w:iCs/>
+          <w:sz w:val="21"/>
+          <w:szCs w:val="21"/>
+          <w:lang w:val="en-US"/>
+        </w:rPr>
+        <w:t>Figure 1: Updated Overall Class Diagram</w:t>
+      </w:r>
     </w:p>
     <w:sectPr>
       <w:headerReference r:id="rId3" w:type="default"/>

</xml_diff>